<commit_message>
fix: handle east asia font names in parser and patcher
</commit_message>
<xml_diff>
--- a/src/thesis_format_engine/web/demo/demo-paper.docx
+++ b/src/thesis_format_engine/web/demo/demo-paper.docx
@@ -8,6 +8,7 @@
       </w:pPr>
       <w:r>
         <w:rPr>
+          <w:rFonts w:ascii="等线" w:hAnsi="等线" w:eastAsia="等线" w:cs="等线"/>
           <w:sz w:val="28"/>
         </w:rPr>
         <w:t>摘要</w:t>
@@ -21,6 +22,7 @@
       </w:pPr>
       <w:r>
         <w:rPr>
+          <w:rFonts w:ascii="等线" w:hAnsi="等线" w:eastAsia="等线" w:cs="等线"/>
           <w:sz w:val="24"/>
         </w:rPr>
         <w:t>这是测试正文段落，用于展示自动检测与修复效果。</w:t>
@@ -32,6 +34,7 @@
       </w:pPr>
       <w:r>
         <w:rPr>
+          <w:rFonts w:ascii="等线" w:hAnsi="等线" w:eastAsia="等线" w:cs="等线"/>
           <w:sz w:val="24"/>
         </w:rPr>
         <w:t>表1：实验结果</w:t>
@@ -63,6 +66,7 @@
             </w:pPr>
             <w:r>
               <w:rPr>
+                <w:rFonts w:ascii="等线" w:hAnsi="等线" w:eastAsia="等线" w:cs="等线"/>
                 <w:sz w:val="24"/>
               </w:rPr>
               <w:t>数据</w:t>
@@ -79,6 +83,7 @@
             </w:pPr>
             <w:r>
               <w:rPr>
+                <w:rFonts w:ascii="等线" w:hAnsi="等线" w:eastAsia="等线" w:cs="等线"/>
                 <w:sz w:val="24"/>
               </w:rPr>
               <w:t>数据</w:t>
@@ -97,6 +102,7 @@
             </w:pPr>
             <w:r>
               <w:rPr>
+                <w:rFonts w:ascii="等线" w:hAnsi="等线" w:eastAsia="等线" w:cs="等线"/>
                 <w:sz w:val="24"/>
               </w:rPr>
               <w:t>数据</w:t>
@@ -113,6 +119,7 @@
             </w:pPr>
             <w:r>
               <w:rPr>
+                <w:rFonts w:ascii="等线" w:hAnsi="等线" w:eastAsia="等线" w:cs="等线"/>
                 <w:sz w:val="24"/>
               </w:rPr>
               <w:t>数据</w:t>
@@ -127,6 +134,7 @@
       </w:pPr>
       <w:r>
         <w:rPr>
+          <w:rFonts w:ascii="等线" w:hAnsi="等线" w:eastAsia="等线" w:cs="等线"/>
           <w:sz w:val="28"/>
         </w:rPr>
         <w:t>参考文献</w:t>

</xml_diff>